<commit_message>
docs: backlog v16 (cloture #ILL-archive/#ILL-reports) + cadrage #ILL-digital + archivage v15
</commit_message>
<xml_diff>
--- a/docs/backlogs/AnarBib-Backlog-2026-05-24-v16.docx
+++ b/docs/backlogs/AnarBib-Backlog-2026-05-24-v16.docx
@@ -441,7 +441,7 @@
         <w:spacing w:after="60" w:line="276" w:lineRule="auto"/>
       </w:pPr>
       <w:r>
-        <w:t>PEB / interbibliothèques : 1 item (#ILL, chantier unique ; 6 sous-travaux livrés, 3 ouverts en sous-points)</w:t>
+        <w:t>PEB / interbibliothèques : 1 item (#ILL, chantier unique ; 5 sous-travaux livrés, 1 ouvert en sous-point)</w:t>
       </w:r>
     </w:p>
     <w:p>
@@ -15887,7 +15887,7 @@
                 <w:sz w:val="17"/>
                 <w:szCs w:val="17"/>
               </w:rPr>
-              <w:t>Chantier PEB — cycle du prêt interbibliothèques. 6 sous-travaux livrés, 3 ouverts (archive, reports, digital) — voir fiche</w:t>
+              <w:t>Chantier PEB — cycle du prêt interbibliothèques. 5 sous-travaux livrés, 1 ouvert (digital, à spécifier) — voir fiche</w:t>
             </w:r>
           </w:p>
         </w:tc>
@@ -15971,7 +15971,7 @@
                 <w:sz w:val="17"/>
                 <w:szCs w:val="17"/>
               </w:rPr>
-              <w:t>🟡 LARGEMENT LIVRÉ — 3 sous-travaux ouverts</w:t>
+              <w:t>🟢 LIVRÉ — 1 sous-travail à spécifier (digital)</w:t>
             </w:r>
           </w:p>
         </w:tc>
@@ -24242,7 +24242,7 @@
           <w:sz w:val="20"/>
           <w:szCs w:val="20"/>
         </w:rPr>
-        <w:t xml:space="preserve">   (✅ en grande partie livré)</w:t>
+        <w:t xml:space="preserve">   (✅ livré — reste #ILL-digital à spécifier)</w:t>
       </w:r>
     </w:p>
     <w:p>
@@ -24283,7 +24283,7 @@
           <w:sz w:val="19"/>
           <w:szCs w:val="19"/>
         </w:rPr>
-        <w:t xml:space="preserve">✅ EN GRANDE PARTIE LIVRÉ      </w:t>
+        <w:t xml:space="preserve">✅ LIVRÉ — reste #ILL-digital à spécifier      </w:t>
       </w:r>
       <w:r>
         <w:rPr>
@@ -24613,7 +24613,7 @@
           <w:sz w:val="19"/>
           <w:szCs w:val="19"/>
         </w:rPr>
-        <w:t xml:space="preserve">Cette section détaille les sous-travaux de la ligne-chantier unique #ILL. Mise à jour du 24/05 : la vérification menée en base et sur le frontend a établi que trois sous-travaux que le v15 croyait ouverts étaient en réalité déjà livrés. Les anciennes lignes de tableau #ILL-lifecycle, #ILL-rpc-anon, #ILL-overdue, #ILL-archive, #ILL-reports et #ILL-digital sont désormais des sous-points de cette fiche. Cf. docs/decisions/CHANTIER_cloture_ILL_2026-05-24.</w:t>
+        <w:t xml:space="preserve">Cette section détaille les sous-travaux de la ligne-chantier unique #ILL. Les anciennes lignes de tableau #ILL-lifecycle, #ILL-rpc-anon, #ILL-overdue, #ILL-archive, #ILL-reports et #ILL-digital sont désormais des sous-points de cette fiche. Au 24/05, la vérification en base avait établi que trois d'entre eux (lifecycle, rpc-anon, overdue) que le v15 croyait ouverts étaient déjà livrés. Les 24 et 25/05, les sous-travaux archive et reports ont été réalisés à leur tour. Au 25/05, le chantier PEB compte donc cinq sous-travaux livrés ; seul le partage numérique (digital) reste ouvert, au stade du cadrage. Cf. docs/decisions/CHANTIER_cloture_ILL_2026-05-24.</w:t>
       </w:r>
     </w:p>
     <w:p>
@@ -24682,6 +24682,30 @@
     </w:p>
     <w:p>
       <w:pPr>
+        <w:spacing w:after="120" w:line="276" w:lineRule="auto"/>
+      </w:pPr>
+      <w:r>
+        <w:rPr>
+          <w:sz w:val="19"/>
+          <w:szCs w:val="19"/>
+        </w:rPr>
+        <w:t xml:space="preserve">✅ Archivage des PEB terminés (ex-#ILL-archive, score 12) — livré le 25/05. Un PEB terminé (devolvido/cancelado) peut être archivé par le staff : il sort de la file active de la page Biblioteca et devient consultable dans l’onglet Rapports. Migration 20260525090000_peb_archive (RPC fn_peb_archive_loan / fn_peb_unarchive_loan, vue api.peb_history_v1) + correctif 20260525100000_peb_archive_fix (conformité aux CHECK archive_consistency / archive_reason : archived_at et archive_reason posés ensemble, cause admin_manual). Frontend : composant PebHistorySection, filtre archived_at de la file active, bouton archiver, garde-fou visuel « à archiver » au-delà de 30 jours, descartar masqué sur les PEB terminaux. i18n 15 clés × 8 langues. Déclenchement manuel retenu (avec garde-fou visuel). Cf. docs/decisions/CHANTIER_cloture_ILL_2026-05-24.</w:t>
+      </w:r>
+    </w:p>
+    <w:p>
+      <w:pPr>
+        <w:spacing w:after="120" w:line="276" w:lineRule="auto"/>
+      </w:pPr>
+      <w:r>
+        <w:rPr>
+          <w:sz w:val="19"/>
+          <w:szCs w:val="19"/>
+        </w:rPr>
+        <w:t xml:space="preserve">✅ Comptes-rendus enrichis (ex-#ILL-reports, score 10) — livré le 25/05. Le compte-rendu hebdomadaire de la page Biblioteca intègre désormais une section PEB : compteurs (PEB en cours, en retard, terminés en attente d’archivage) et liste des PEB en cours avec le sens du prêt, le partenaire et les titres des exemplaires. Volet B : correctif du rafraîchissement de la file active au désarchivage (callback onChange PebHistorySection vers loadAll). Volet C : correction terminologique pt-BR « conta-rendida » → « relatório ». i18n 7 clés × 8 langues. Résout le sous-constat (a) de #153.</w:t>
+      </w:r>
+    </w:p>
+    <w:p>
+      <w:pPr>
         <w:keepNext/>
         <w:spacing w:before="160" w:after="40" w:line="276" w:lineRule="auto"/>
       </w:pPr>
@@ -24705,31 +24729,7 @@
           <w:sz w:val="19"/>
           <w:szCs w:val="19"/>
         </w:rPr>
-        <w:t xml:space="preserve">🟠 Archivage des PEB terminés (ex-#ILL-archive, score 12). La liste des PEB de la page Biblioteca s’allonge sans limite. Un PEB terminé doit sortir de la file active et devenir consultable à la demande dans l’onglet Relatórios. À cadrer : marqueur d’archivage (colonne archived_at, qui existe déjà en base) ; déclenchement (automatique au passage devolvido/cancelado, manuel, ou différé) ; vue api.peb_history_v1 ; réversibilité. À construire sur le modèle des vues api.painel_*_history_v1. C’est le seul vrai morceau de code restant du chantier PEB.</w:t>
-      </w:r>
-    </w:p>
-    <w:p>
-      <w:pPr>
-        <w:spacing w:after="120" w:line="276" w:lineRule="auto"/>
-      </w:pPr>
-      <w:r>
-        <w:rPr>
-          <w:sz w:val="19"/>
-          <w:szCs w:val="19"/>
-        </w:rPr>
-        <w:t xml:space="preserve">🟠 Comptes-rendus enrichis (ex-#ILL-reports, score 10). Les comptes-rendus hebdomadaires n’intègrent pas l’activité PEB. À enrichir pour qu’un CR reflète les prêts ouverts, retours et échanges en cours. À mener après l’archivage, dont il réutilise la vue d’historique. Recoupe le sous-constat (a) de #153.</w:t>
-      </w:r>
-    </w:p>
-    <w:p>
-      <w:pPr>
-        <w:spacing w:after="120" w:line="276" w:lineRule="auto"/>
-      </w:pPr>
-      <w:r>
-        <w:rPr>
-          <w:sz w:val="19"/>
-          <w:szCs w:val="19"/>
-        </w:rPr>
-        <w:t xml:space="preserve">🟡 Partage numérique (ex-#ILL-digital, score 5, en réflexion). Entre deux bibliothèques éloignées, la circulation d’un document épuisé passe souvent par la dématérialisation : scan, PDF, impression locale, sans retour d’objet. Circuit distinct à réfléchir sans calquer la mécanique de retour du PEB. Non mûr, inscrit pour mémoire.</w:t>
+        <w:t xml:space="preserve">🟡 Partage numérique (ex-#ILL-digital, score 5) — à spécifier. Entre deux bibliothèques éloignées, la circulation d’un document épuisé ou fragile passe souvent par la dématérialisation : scan, PDF, impression locale, sans retour d’objet. Ce sous-travail ne sera PAS une extension du PEB : le partage numérique est un circuit distinct, à cheval sur Biblioteca, Catalogção et/ou Importações, à concevoir sans calquer la mécanique de retour du PEB (qui présuppose un objet physique faisant l’aller-retour). Prochaine étape : une note de cadrage posant les questions ouvertes (statut des documents numérisés, périmètre, conservation du fichier) — pas une implémentation. Non mûr, inscrit pour mémoire.</w:t>
       </w:r>
     </w:p>
     <w:p>

</xml_diff>